<commit_message>
Lab 3 dry-run fixes (L3-1 through L3-6), Day 1 schedule shift (lab 3 → 90 min, end at 4:55 PM)
</commit_message>
<xml_diff>
--- a/workshop-site/labs/Lab 03 - Participant.docx
+++ b/workshop-site/labs/Lab 03 - Participant.docx
@@ -25,7 +25,7 @@
           <w:color w:val="6A6A6A"/>
           <w:sz w:val="20"/>
         </w:rPr>
-        <w:t>ServicePulse 360 Workshop v0.7 (revision 3) | Estimated time: 92 minutes | Using the standard Asset object, you will prepare the Asset Layout, model an NYCT bus as a parent Asset with four component Assets (battery pack, HVAC unit, drive motor, farebox), create peer relationships via Asset Relationship, and connect your golden Case record to the bus Asset.</w:t>
+        <w:t>ServicePulse 360 Workshop v0.7 (revision 4) | Estimated time: 90 minutes | Using the standard Asset object, you will prepare the Asset Layout, model an NYCT bus as a parent Asset with four component Assets (battery pack, HVAC unit, drive motor, farebox), create peer relationships via Asset Relationship, and connect your golden Case record to the bus Asset.</w:t>
       </w:r>
     </w:p>
     <w:p>
@@ -82,7 +82,7 @@
     </w:p>
     <w:p>
       <w:r>
-        <w:t>Three levels, five Assets total:</w:t>
+        <w:t>Two levels, five Assets total (one parent bus, four children):</w:t>
       </w:r>
     </w:p>
     <w:p>
@@ -105,7 +105,7 @@
     </w:p>
     <w:p>
       <w:r>
-        <w:t>Each component is a child of the bus via an Asset Relationship record. The children can have their own Cases (an issue specific to the battery pack vs. the bus overall), and both the bus and each component can appear on the Related List - Single component you built in Lab 2.</w:t>
+        <w:t>Each component is a child of the bus via the Parent Asset field (the direct hierarchy you'll build in Parts 4-5). Asset Relationships (Part 6) model peer-to-peer links between Assets at the same level, not the hierarchy itself. The children can have their own Cases (an issue specific to the battery pack vs. the bus overall), and both the bus and each component can appear on the Related List - Single component you built in Lab 2.</w:t>
       </w:r>
     </w:p>
     <w:p>
@@ -371,7 +371,7 @@
         <w:t xml:space="preserve">Fallback if Assets isn't visible: </w:t>
       </w:r>
       <w:r>
-        <w:t>Setup UI changes sometimes take a minute to propagate. If Assets doesn't appear in the nav bar after returning to the app, use the manual personalize-nav approach instead: on any page in the ServicePulse 360 app, click the pencil icon on the far right of the navigation bar. The Edit [App] Navigation Items dialog opens. Click Add More Items. Search Assets, pick it, click Add 1 Nav Item. Save. Assets now appears.</w:t>
+        <w:t>In most workshop orgs the Asset tab is pre-set to Default On via the pre-workshop deploy, so adding Assets to the App Launcher is enough. If your org wasn't pre-deployed (or the setting didn't take), use the pencil-icon fallback: on any page in the ServicePulse 360 app, click the pencil icon on the far right of the navigation bar. The Edit [App] Navigation Items dialog opens. Click Add More Items. Search Assets, pick it, click Add 1 Nav Item. Save. Assets now appears.</w:t>
       </w:r>
     </w:p>
     <w:p>
@@ -542,7 +542,7 @@
         <w:t xml:space="preserve">1. </w:t>
       </w:r>
       <w:r>
-        <w:t>In the Page Layouts list, click the layout named "Asset Layout".</w:t>
+        <w:t>Navigate: Setup &gt; Object Manager &gt; Asset &gt; Page Layouts. In the Page Layouts list, click the layout named "Asset Layout".</w:t>
       </w:r>
     </w:p>
     <w:p>
@@ -620,10 +620,7 @@
         <w:ind w:left="680" w:hanging="227"/>
       </w:pPr>
       <w:r>
-        <w:t xml:space="preserve">• </w:t>
-      </w:r>
-      <w:r>
-        <w:t>Price</w:t>
+        <w:t xml:space="preserve">• Price</w:t>
       </w:r>
     </w:p>
     <w:p>
@@ -632,10 +629,7 @@
         <w:ind w:left="680" w:hanging="227"/>
       </w:pPr>
       <w:r>
-        <w:t xml:space="preserve">• </w:t>
-      </w:r>
-      <w:r>
-        <w:t>Usage End Date</w:t>
+        <w:t xml:space="preserve">• Usage End Date</w:t>
       </w:r>
     </w:p>
     <w:p>
@@ -644,10 +638,7 @@
         <w:ind w:left="680" w:hanging="227"/>
       </w:pPr>
       <w:r>
-        <w:t xml:space="preserve">• </w:t>
-      </w:r>
-      <w:r>
-        <w:t>Contact</w:t>
+        <w:t xml:space="preserve">• Contact</w:t>
       </w:r>
     </w:p>
     <w:p>
@@ -656,10 +647,7 @@
         <w:ind w:left="680" w:hanging="227"/>
       </w:pPr>
       <w:r>
-        <w:t xml:space="preserve">• </w:t>
-      </w:r>
-      <w:r>
-        <w:t>Competitor Asset</w:t>
+        <w:t xml:space="preserve">• Competitor Asset</w:t>
       </w:r>
     </w:p>
     <w:p>
@@ -668,10 +656,7 @@
         <w:ind w:left="680" w:hanging="227"/>
       </w:pPr>
       <w:r>
-        <w:t xml:space="preserve">• </w:t>
-      </w:r>
-      <w:r>
-        <w:t>Purchase Date</w:t>
+        <w:t xml:space="preserve">• Purchase Date</w:t>
       </w:r>
     </w:p>
     <w:p>
@@ -768,10 +753,7 @@
         <w:ind w:left="680" w:hanging="227"/>
       </w:pPr>
       <w:r>
-        <w:t xml:space="preserve">• </w:t>
-      </w:r>
-      <w:r>
-        <w:t>Asset Name</w:t>
+        <w:t xml:space="preserve">• Asset Name</w:t>
       </w:r>
     </w:p>
     <w:p>
@@ -780,10 +762,7 @@
         <w:ind w:left="680" w:hanging="227"/>
       </w:pPr>
       <w:r>
-        <w:t xml:space="preserve">• </w:t>
-      </w:r>
-      <w:r>
-        <w:t>Serial Number</w:t>
+        <w:t xml:space="preserve">• Serial Number</w:t>
       </w:r>
     </w:p>
     <w:p>
@@ -792,10 +771,7 @@
         <w:ind w:left="680" w:hanging="227"/>
       </w:pPr>
       <w:r>
-        <w:t xml:space="preserve">• </w:t>
-      </w:r>
-      <w:r>
-        <w:t>Account Name</w:t>
+        <w:t xml:space="preserve">• Account Name</w:t>
       </w:r>
     </w:p>
     <w:p>
@@ -804,10 +780,7 @@
         <w:ind w:left="680" w:hanging="227"/>
       </w:pPr>
       <w:r>
-        <w:t xml:space="preserve">• </w:t>
-      </w:r>
-      <w:r>
-        <w:t>Status</w:t>
+        <w:t xml:space="preserve">• Status</w:t>
       </w:r>
     </w:p>
     <w:p>
@@ -834,7 +807,7 @@
           <w:b/>
           <w:sz w:val="24"/>
         </w:rPr>
-        <w:t>3.5 — Add the Related Assets related list below Child Assets</w:t>
+        <w:t>3.5 — Add the Related Assets and Primary Assets related lists below Child Assets</w:t>
       </w:r>
     </w:p>
     <w:p>
@@ -888,10 +861,7 @@
         <w:ind w:left="680" w:hanging="227"/>
       </w:pPr>
       <w:r>
-        <w:t xml:space="preserve">• </w:t>
-      </w:r>
-      <w:r>
-        <w:t>Asset Relationship Number</w:t>
+        <w:t xml:space="preserve">• Asset Relationship Number</w:t>
       </w:r>
     </w:p>
     <w:p>
@@ -900,10 +870,7 @@
         <w:ind w:left="680" w:hanging="227"/>
       </w:pPr>
       <w:r>
-        <w:t xml:space="preserve">• </w:t>
-      </w:r>
-      <w:r>
-        <w:t>Related Asset</w:t>
+        <w:t xml:space="preserve">• Related Asset</w:t>
       </w:r>
     </w:p>
     <w:p>
@@ -912,10 +879,7 @@
         <w:ind w:left="680" w:hanging="227"/>
       </w:pPr>
       <w:r>
-        <w:t xml:space="preserve">• </w:t>
-      </w:r>
-      <w:r>
-        <w:t>Relationship Type</w:t>
+        <w:t xml:space="preserve">• Relationship Type</w:t>
       </w:r>
     </w:p>
     <w:p>
@@ -931,6 +895,21 @@
       </w:r>
       <w:r>
         <w:t>Click OK.</w:t>
+      </w:r>
+    </w:p>
+    <w:p>
+      <w:pPr>
+        <w:spacing w:after="40"/>
+        <w:ind w:left="340" w:hanging="340"/>
+      </w:pPr>
+      <w:r>
+        <w:rPr>
+          <w:b/>
+        </w:rPr>
+        <w:t xml:space="preserve">5. </w:t>
+      </w:r>
+      <w:r>
+        <w:t>From the palette, drag Primary Assets into the Related Lists section, directly beneath Related Assets. In Part 6 you'll create an Asset Relationship from Battery Pack to HVAC Unit. Related Assets shows that record on Battery Pack (the primary side); Primary Assets shows the same record on HVAC Unit (the reverse side). One Asset Relationship record, two views, driven by which Asset you're looking at.</w:t>
       </w:r>
     </w:p>
     <w:p>
@@ -2317,10 +2296,7 @@
         <w:ind w:left="680" w:hanging="227"/>
       </w:pPr>
       <w:r>
-        <w:t xml:space="preserve">• </w:t>
-      </w:r>
-      <w:r>
-        <w:t>Parent Record: click the lookup icon. Pick Asset.</w:t>
+        <w:t xml:space="preserve">• Parent Record: click the lookup icon. Pick Asset.</w:t>
       </w:r>
     </w:p>
     <w:p>
@@ -2329,10 +2305,7 @@
         <w:ind w:left="680" w:hanging="227"/>
       </w:pPr>
       <w:r>
-        <w:t xml:space="preserve">• </w:t>
-      </w:r>
-      <w:r>
-        <w:t>Related List: click the lookup icon then pick Cases.</w:t>
+        <w:t xml:space="preserve">• Related List: click the lookup icon then pick Cases.</w:t>
       </w:r>
     </w:p>
     <w:p>
@@ -2341,10 +2314,7 @@
         <w:ind w:left="680" w:hanging="227"/>
       </w:pPr>
       <w:r>
-        <w:t xml:space="preserve">• </w:t>
-      </w:r>
-      <w:r>
-        <w:t>Related List Type: Default.</w:t>
+        <w:t xml:space="preserve">• Related List Type: Default.</w:t>
       </w:r>
     </w:p>
     <w:p>

</xml_diff>